<commit_message>
Sync all artifacts with revised module content
Update outline, HTML, handouts, slides, and exercises to match
the streamlined modules M8-M15:
- Fix durations: M9 (25→15), M10 (30→15), M12 (15→10), M15 (25→30)
- Remove references to cut content: HTTP hooks, async hooks,
  worktrees, dispatch, agent SDK, messages API, teleported sessions
- Update M8 exercise from GitHub MCP to local filesystem MCP
- Update M9 exercise from prettier hook to security hook
- Fix M10 exercise label (was "Module 9")
- Update HTML module cards with correct descriptions and times
- Update feature coverage matrix in outline

Co-Authored-By: Claude Opus 4.6 <noreply@anthropic.com>
</commit_message>
<xml_diff>
--- a/handout/M08-M10-integration-reference.docx
+++ b/handout/M08-M10-integration-reference.docx
@@ -1,6 +1,6 @@
 
 <file path=word/document.xml><?xml version="1.0" encoding="utf-8"?>
-<w:document xmlns:wpc="http://schemas.microsoft.com/office/word/2010/wordprocessingCanvas" xmlns:mc="http://schemas.openxmlformats.org/markup-compatibility/2006" xmlns:o="urn:schemas-microsoft-com:office:office" xmlns:r="http://schemas.openxmlformats.org/officeDocument/2006/relationships" xmlns:m="http://schemas.openxmlformats.org/officeDocument/2006/math" xmlns:v="urn:schemas-microsoft-com:vml" xmlns:wp14="http://schemas.microsoft.com/office/word/2010/wordprocessingDrawing" xmlns:wp="http://schemas.openxmlformats.org/drawingml/2006/wordprocessingDrawing" xmlns:w10="urn:schemas-microsoft-com:office:word" xmlns:w="http://schemas.openxmlformats.org/wordprocessingml/2006/main" xmlns:w14="http://schemas.microsoft.com/office/word/2010/wordml" xmlns:w15="http://schemas.microsoft.com/office/word/2012/wordml" xmlns:wpg="http://schemas.microsoft.com/office/word/2010/wordprocessingGroup" xmlns:wpi="http://schemas.microsoft.com/office/word/2010/wordprocessingInk" xmlns:wne="http://schemas.microsoft.com/office/word/2006/wordml" xmlns:wps="http://schemas.microsoft.com/office/word/2010/wordprocessingShape" xmlns:cx="http://schemas.microsoft.com/office/drawing/2014/chartex" xmlns:cx1="http://schemas.microsoft.com/office/drawing/2015/9/8/chartex" xmlns:cx2="http://schemas.microsoft.com/office/drawing/2015/10/21/chartex" xmlns:cx3="http://schemas.microsoft.com/office/drawing/2016/5/9/chartex" xmlns:cx4="http://schemas.microsoft.com/office/drawing/2016/5/10/chartex" xmlns:cx5="http://schemas.microsoft.com/office/drawing/2016/5/11/chartex" xmlns:cx6="http://schemas.microsoft.com/office/drawing/2016/5/12/chartex" xmlns:cx7="http://schemas.microsoft.com/office/drawing/2016/5/13/chartex" xmlns:cx8="http://schemas.microsoft.com/office/drawing/2016/5/14/chartex" xmlns:aink="http://schemas.microsoft.com/office/drawing/2016/ink" xmlns:am3d="http://schemas.microsoft.com/office/drawing/2017/model3d" xmlns:w16cex="http://schemas.microsoft.com/office/word/2018/wordml/cex" xmlns:w16cid="http://schemas.microsoft.com/office/word/2016/wordml/cid" xmlns:w16="http://schemas.microsoft.com/office/word/2018/wordml" xmlns:w16sdtdh="http://schemas.microsoft.com/office/word/2020/wordml/sdtdatahash" xmlns:w16se="http://schemas.microsoft.com/office/word/2015/wordml/symex" mc:Ignorable="w14 w15 wp14">
+<w:document xmlns:mc="http://schemas.openxmlformats.org/markup-compatibility/2006" xmlns:ns2="http://schemas.openxmlformats.org/officeDocument/2006/relationships" xmlns:w="http://schemas.openxmlformats.org/wordprocessingml/2006/main" mc:Ignorable="w14 w15 wp14">
   <w:body>
     <w:p>
       <w:pPr>
@@ -190,7 +190,7 @@
                 <w:sz w:val="18"/>
                 <w:szCs w:val="18"/>
               </w:rPr>
-              <w:t xml:space="preserve">Add HTTP server (cloud)</w:t>
+              <w:t xml:space="preserve">Add HTTP server</w:t>
             </w:r>
           </w:p>
         </w:tc>
@@ -647,24 +647,25 @@
               <w:bottom w:val="single" w:color="E2E8F0" w:sz="1"/>
               <w:right w:val="single" w:color="E2E8F0" w:sz="1"/>
             </w:tcBorders>
-            <w:tcMar>
-              <w:top w:type="dxa" w:w="60"/>
-              <w:left w:type="dxa" w:w="100"/>
-              <w:bottom w:type="dxa" w:w="60"/>
-              <w:right w:type="dxa" w:w="100"/>
-            </w:tcMar>
-          </w:tcPr>
-          <w:p>
-            <w:r>
-              <w:rPr>
-                <w:rFonts w:ascii="Calibri" w:cs="Calibri" w:eastAsia="Calibri" w:hAnsi="Calibri"/>
-                <w:b/>
-                <w:bCs/>
-                <w:color w:val="1E293B"/>
-                <w:sz w:val="18"/>
-                <w:szCs w:val="18"/>
-              </w:rPr>
-              <w:t xml:space="preserve">--env KEY=value</w:t>
+            <w:shd w:fill="F8FAFC" w:val="clear"/>
+            <w:tcMar>
+              <w:top w:type="dxa" w:w="60"/>
+              <w:left w:type="dxa" w:w="100"/>
+              <w:bottom w:type="dxa" w:w="60"/>
+              <w:right w:type="dxa" w:w="100"/>
+            </w:tcMar>
+          </w:tcPr>
+          <w:p>
+            <w:r>
+              <w:rPr>
+                <w:rFonts w:ascii="Calibri" w:cs="Calibri" w:eastAsia="Calibri" w:hAnsi="Calibri"/>
+                <w:b/>
+                <w:bCs/>
+                <w:color w:val="1E293B"/>
+                <w:sz w:val="18"/>
+                <w:szCs w:val="18"/>
+              </w:rPr>
+              <w:t xml:space="preserve">Windows: cmd /c &lt;command&gt;</w:t>
             </w:r>
           </w:p>
         </w:tc>
@@ -677,38 +678,6 @@
               <w:bottom w:val="single" w:color="E2E8F0" w:sz="1"/>
               <w:right w:val="single" w:color="E2E8F0" w:sz="1"/>
             </w:tcBorders>
-            <w:tcMar>
-              <w:top w:type="dxa" w:w="60"/>
-              <w:left w:type="dxa" w:w="100"/>
-              <w:bottom w:type="dxa" w:w="60"/>
-              <w:right w:type="dxa" w:w="100"/>
-            </w:tcMar>
-          </w:tcPr>
-          <w:p>
-            <w:r>
-              <w:rPr>
-                <w:rFonts w:ascii="Calibri" w:cs="Calibri" w:eastAsia="Calibri" w:hAnsi="Calibri"/>
-                <w:b w:val="false"/>
-                <w:bCs w:val="false"/>
-                <w:color w:val="1E293B"/>
-                <w:sz w:val="18"/>
-                <w:szCs w:val="18"/>
-              </w:rPr>
-              <w:t xml:space="preserve">Pass environment variables</w:t>
-            </w:r>
-          </w:p>
-        </w:tc>
-      </w:tr>
-      <w:tr>
-        <w:tc>
-          <w:tcPr>
-            <w:tcW w:type="dxa" w:w="5500"/>
-            <w:tcBorders>
-              <w:top w:val="single" w:color="E2E8F0" w:sz="1"/>
-              <w:left w:val="single" w:color="E2E8F0" w:sz="1"/>
-              <w:bottom w:val="single" w:color="E2E8F0" w:sz="1"/>
-              <w:right w:val="single" w:color="E2E8F0" w:sz="1"/>
-            </w:tcBorders>
             <w:shd w:fill="F8FAFC" w:val="clear"/>
             <w:tcMar>
               <w:top w:type="dxa" w:w="60"/>
@@ -721,44 +690,13 @@
             <w:r>
               <w:rPr>
                 <w:rFonts w:ascii="Calibri" w:cs="Calibri" w:eastAsia="Calibri" w:hAnsi="Calibri"/>
-                <w:b/>
-                <w:bCs/>
-                <w:color w:val="1E293B"/>
-                <w:sz w:val="18"/>
-                <w:szCs w:val="18"/>
-              </w:rPr>
-              <w:t xml:space="preserve">--header "Auth: Bearer ..."</w:t>
-            </w:r>
-          </w:p>
-        </w:tc>
-        <w:tc>
-          <w:tcPr>
-            <w:tcW w:type="dxa" w:w="4966"/>
-            <w:tcBorders>
-              <w:top w:val="single" w:color="E2E8F0" w:sz="1"/>
-              <w:left w:val="single" w:color="E2E8F0" w:sz="1"/>
-              <w:bottom w:val="single" w:color="E2E8F0" w:sz="1"/>
-              <w:right w:val="single" w:color="E2E8F0" w:sz="1"/>
-            </w:tcBorders>
-            <w:shd w:fill="F8FAFC" w:val="clear"/>
-            <w:tcMar>
-              <w:top w:type="dxa" w:w="60"/>
-              <w:left w:type="dxa" w:w="100"/>
-              <w:bottom w:type="dxa" w:w="60"/>
-              <w:right w:type="dxa" w:w="100"/>
-            </w:tcMar>
-          </w:tcPr>
-          <w:p>
-            <w:r>
-              <w:rPr>
-                <w:rFonts w:ascii="Calibri" w:cs="Calibri" w:eastAsia="Calibri" w:hAnsi="Calibri"/>
-                <w:b w:val="false"/>
-                <w:bCs w:val="false"/>
-                <w:color w:val="1E293B"/>
-                <w:sz w:val="18"/>
-                <w:szCs w:val="18"/>
-              </w:rPr>
-              <w:t xml:space="preserve">Add HTTP headers</w:t>
+                <w:b w:val="false"/>
+                <w:bCs w:val="false"/>
+                <w:color w:val="1E293B"/>
+                <w:sz w:val="18"/>
+                <w:szCs w:val="18"/>
+              </w:rPr>
+              <w:t xml:space="preserve">Wrap stdio commands on Windows</w:t>
             </w:r>
           </w:p>
         </w:tc>
@@ -1211,6 +1149,23 @@
     </w:p>
     <w:p>
       <w:pPr>
+        <w:pStyle w:val="Heading1"/>
+        <w:spacing w:before="200"/>
+      </w:pPr>
+      <w:r>
+        <w:rPr>
+          <w:rFonts w:ascii="Calibri" w:cs="Calibri" w:eastAsia="Calibri" w:hAnsi="Calibri"/>
+          <w:b/>
+          <w:bCs/>
+          <w:color w:val="1E2761"/>
+          <w:sz w:val="28"/>
+          <w:szCs w:val="28"/>
+        </w:rPr>
+        <w:t xml:space="preserve">Hooks: Deterministic Guardrails</w:t>
+      </w:r>
+    </w:p>
+    <w:p>
+      <w:pPr>
         <w:pStyle w:val="Heading2"/>
         <w:spacing w:before="200"/>
       </w:pPr>
@@ -1627,25 +1582,24 @@
               <w:bottom w:val="single" w:color="E2E8F0" w:sz="1"/>
               <w:right w:val="single" w:color="E2E8F0" w:sz="1"/>
             </w:tcBorders>
-            <w:shd w:fill="F8FAFC" w:val="clear"/>
-            <w:tcMar>
-              <w:top w:type="dxa" w:w="60"/>
-              <w:left w:type="dxa" w:w="100"/>
-              <w:bottom w:type="dxa" w:w="60"/>
-              <w:right w:type="dxa" w:w="100"/>
-            </w:tcMar>
-          </w:tcPr>
-          <w:p>
-            <w:r>
-              <w:rPr>
-                <w:rFonts w:ascii="Calibri" w:cs="Calibri" w:eastAsia="Calibri" w:hAnsi="Calibri"/>
-                <w:b/>
-                <w:bCs/>
-                <w:color w:val="1E293B"/>
-                <w:sz w:val="18"/>
-                <w:szCs w:val="18"/>
-              </w:rPr>
-              <w:t xml:space="preserve">UserPromptSubmit</w:t>
+            <w:tcMar>
+              <w:top w:type="dxa" w:w="60"/>
+              <w:left w:type="dxa" w:w="100"/>
+              <w:bottom w:type="dxa" w:w="60"/>
+              <w:right w:type="dxa" w:w="100"/>
+            </w:tcMar>
+          </w:tcPr>
+          <w:p>
+            <w:r>
+              <w:rPr>
+                <w:rFonts w:ascii="Calibri" w:cs="Calibri" w:eastAsia="Calibri" w:hAnsi="Calibri"/>
+                <w:b/>
+                <w:bCs/>
+                <w:color w:val="1E293B"/>
+                <w:sz w:val="18"/>
+                <w:szCs w:val="18"/>
+              </w:rPr>
+              <w:t xml:space="preserve">Stop</w:t>
             </w:r>
           </w:p>
         </w:tc>
@@ -1658,25 +1612,24 @@
               <w:bottom w:val="single" w:color="E2E8F0" w:sz="1"/>
               <w:right w:val="single" w:color="E2E8F0" w:sz="1"/>
             </w:tcBorders>
-            <w:shd w:fill="F8FAFC" w:val="clear"/>
-            <w:tcMar>
-              <w:top w:type="dxa" w:w="60"/>
-              <w:left w:type="dxa" w:w="100"/>
-              <w:bottom w:type="dxa" w:w="60"/>
-              <w:right w:type="dxa" w:w="100"/>
-            </w:tcMar>
-          </w:tcPr>
-          <w:p>
-            <w:r>
-              <w:rPr>
-                <w:rFonts w:ascii="Calibri" w:cs="Calibri" w:eastAsia="Calibri" w:hAnsi="Calibri"/>
-                <w:b w:val="false"/>
-                <w:bCs w:val="false"/>
-                <w:color w:val="1E293B"/>
-                <w:sz w:val="18"/>
-                <w:szCs w:val="18"/>
-              </w:rPr>
-              <w:t xml:space="preserve">User sends message</w:t>
+            <w:tcMar>
+              <w:top w:type="dxa" w:w="60"/>
+              <w:left w:type="dxa" w:w="100"/>
+              <w:bottom w:type="dxa" w:w="60"/>
+              <w:right w:type="dxa" w:w="100"/>
+            </w:tcMar>
+          </w:tcPr>
+          <w:p>
+            <w:r>
+              <w:rPr>
+                <w:rFonts w:ascii="Calibri" w:cs="Calibri" w:eastAsia="Calibri" w:hAnsi="Calibri"/>
+                <w:b w:val="false"/>
+                <w:bCs w:val="false"/>
+                <w:color w:val="1E293B"/>
+                <w:sz w:val="18"/>
+                <w:szCs w:val="18"/>
+              </w:rPr>
+              <w:t xml:space="preserve">Claude finishes</w:t>
             </w:r>
           </w:p>
         </w:tc>
@@ -1689,99 +1642,6 @@
               <w:bottom w:val="single" w:color="E2E8F0" w:sz="1"/>
               <w:right w:val="single" w:color="E2E8F0" w:sz="1"/>
             </w:tcBorders>
-            <w:shd w:fill="F8FAFC" w:val="clear"/>
-            <w:tcMar>
-              <w:top w:type="dxa" w:w="60"/>
-              <w:left w:type="dxa" w:w="100"/>
-              <w:bottom w:type="dxa" w:w="60"/>
-              <w:right w:type="dxa" w:w="100"/>
-            </w:tcMar>
-          </w:tcPr>
-          <w:p>
-            <w:r>
-              <w:rPr>
-                <w:rFonts w:ascii="Calibri" w:cs="Calibri" w:eastAsia="Calibri" w:hAnsi="Calibri"/>
-                <w:b w:val="false"/>
-                <w:bCs w:val="false"/>
-                <w:color w:val="1E293B"/>
-                <w:sz w:val="18"/>
-                <w:szCs w:val="18"/>
-              </w:rPr>
-              <w:t xml:space="preserve">Logging, validation</w:t>
-            </w:r>
-          </w:p>
-        </w:tc>
-      </w:tr>
-      <w:tr>
-        <w:tc>
-          <w:tcPr>
-            <w:tcW w:type="dxa" w:w="2200"/>
-            <w:tcBorders>
-              <w:top w:val="single" w:color="E2E8F0" w:sz="1"/>
-              <w:left w:val="single" w:color="E2E8F0" w:sz="1"/>
-              <w:bottom w:val="single" w:color="E2E8F0" w:sz="1"/>
-              <w:right w:val="single" w:color="E2E8F0" w:sz="1"/>
-            </w:tcBorders>
-            <w:tcMar>
-              <w:top w:type="dxa" w:w="60"/>
-              <w:left w:type="dxa" w:w="100"/>
-              <w:bottom w:type="dxa" w:w="60"/>
-              <w:right w:type="dxa" w:w="100"/>
-            </w:tcMar>
-          </w:tcPr>
-          <w:p>
-            <w:r>
-              <w:rPr>
-                <w:rFonts w:ascii="Calibri" w:cs="Calibri" w:eastAsia="Calibri" w:hAnsi="Calibri"/>
-                <w:b/>
-                <w:bCs/>
-                <w:color w:val="1E293B"/>
-                <w:sz w:val="18"/>
-                <w:szCs w:val="18"/>
-              </w:rPr>
-              <w:t xml:space="preserve">Stop</w:t>
-            </w:r>
-          </w:p>
-        </w:tc>
-        <w:tc>
-          <w:tcPr>
-            <w:tcW w:type="dxa" w:w="2800"/>
-            <w:tcBorders>
-              <w:top w:val="single" w:color="E2E8F0" w:sz="1"/>
-              <w:left w:val="single" w:color="E2E8F0" w:sz="1"/>
-              <w:bottom w:val="single" w:color="E2E8F0" w:sz="1"/>
-              <w:right w:val="single" w:color="E2E8F0" w:sz="1"/>
-            </w:tcBorders>
-            <w:tcMar>
-              <w:top w:type="dxa" w:w="60"/>
-              <w:left w:type="dxa" w:w="100"/>
-              <w:bottom w:type="dxa" w:w="60"/>
-              <w:right w:type="dxa" w:w="100"/>
-            </w:tcMar>
-          </w:tcPr>
-          <w:p>
-            <w:r>
-              <w:rPr>
-                <w:rFonts w:ascii="Calibri" w:cs="Calibri" w:eastAsia="Calibri" w:hAnsi="Calibri"/>
-                <w:b w:val="false"/>
-                <w:bCs w:val="false"/>
-                <w:color w:val="1E293B"/>
-                <w:sz w:val="18"/>
-                <w:szCs w:val="18"/>
-              </w:rPr>
-              <w:t xml:space="preserve">Claude finishes</w:t>
-            </w:r>
-          </w:p>
-        </w:tc>
-        <w:tc>
-          <w:tcPr>
-            <w:tcW w:type="dxa" w:w="5466"/>
-            <w:tcBorders>
-              <w:top w:val="single" w:color="E2E8F0" w:sz="1"/>
-              <w:left w:val="single" w:color="E2E8F0" w:sz="1"/>
-              <w:bottom w:val="single" w:color="E2E8F0" w:sz="1"/>
-              <w:right w:val="single" w:color="E2E8F0" w:sz="1"/>
-            </w:tcBorders>
             <w:tcMar>
               <w:top w:type="dxa" w:w="60"/>
               <w:left w:type="dxa" w:w="100"/>
@@ -1800,288 +1660,6 @@
                 <w:szCs w:val="18"/>
               </w:rPr>
               <w:t xml:space="preserve">Notifications, telemetry</w:t>
-            </w:r>
-          </w:p>
-        </w:tc>
-      </w:tr>
-      <w:tr>
-        <w:tc>
-          <w:tcPr>
-            <w:tcW w:type="dxa" w:w="2200"/>
-            <w:tcBorders>
-              <w:top w:val="single" w:color="E2E8F0" w:sz="1"/>
-              <w:left w:val="single" w:color="E2E8F0" w:sz="1"/>
-              <w:bottom w:val="single" w:color="E2E8F0" w:sz="1"/>
-              <w:right w:val="single" w:color="E2E8F0" w:sz="1"/>
-            </w:tcBorders>
-            <w:shd w:fill="F8FAFC" w:val="clear"/>
-            <w:tcMar>
-              <w:top w:type="dxa" w:w="60"/>
-              <w:left w:type="dxa" w:w="100"/>
-              <w:bottom w:type="dxa" w:w="60"/>
-              <w:right w:type="dxa" w:w="100"/>
-            </w:tcMar>
-          </w:tcPr>
-          <w:p>
-            <w:r>
-              <w:rPr>
-                <w:rFonts w:ascii="Calibri" w:cs="Calibri" w:eastAsia="Calibri" w:hAnsi="Calibri"/>
-                <w:b/>
-                <w:bCs/>
-                <w:color w:val="1E293B"/>
-                <w:sz w:val="18"/>
-                <w:szCs w:val="18"/>
-              </w:rPr>
-              <w:t xml:space="preserve">SubagentStop</w:t>
-            </w:r>
-          </w:p>
-        </w:tc>
-        <w:tc>
-          <w:tcPr>
-            <w:tcW w:type="dxa" w:w="2800"/>
-            <w:tcBorders>
-              <w:top w:val="single" w:color="E2E8F0" w:sz="1"/>
-              <w:left w:val="single" w:color="E2E8F0" w:sz="1"/>
-              <w:bottom w:val="single" w:color="E2E8F0" w:sz="1"/>
-              <w:right w:val="single" w:color="E2E8F0" w:sz="1"/>
-            </w:tcBorders>
-            <w:shd w:fill="F8FAFC" w:val="clear"/>
-            <w:tcMar>
-              <w:top w:type="dxa" w:w="60"/>
-              <w:left w:type="dxa" w:w="100"/>
-              <w:bottom w:type="dxa" w:w="60"/>
-              <w:right w:type="dxa" w:w="100"/>
-            </w:tcMar>
-          </w:tcPr>
-          <w:p>
-            <w:r>
-              <w:rPr>
-                <w:rFonts w:ascii="Calibri" w:cs="Calibri" w:eastAsia="Calibri" w:hAnsi="Calibri"/>
-                <w:b w:val="false"/>
-                <w:bCs w:val="false"/>
-                <w:color w:val="1E293B"/>
-                <w:sz w:val="18"/>
-                <w:szCs w:val="18"/>
-              </w:rPr>
-              <w:t xml:space="preserve">Subagent completes</w:t>
-            </w:r>
-          </w:p>
-        </w:tc>
-        <w:tc>
-          <w:tcPr>
-            <w:tcW w:type="dxa" w:w="5466"/>
-            <w:tcBorders>
-              <w:top w:val="single" w:color="E2E8F0" w:sz="1"/>
-              <w:left w:val="single" w:color="E2E8F0" w:sz="1"/>
-              <w:bottom w:val="single" w:color="E2E8F0" w:sz="1"/>
-              <w:right w:val="single" w:color="E2E8F0" w:sz="1"/>
-            </w:tcBorders>
-            <w:shd w:fill="F8FAFC" w:val="clear"/>
-            <w:tcMar>
-              <w:top w:type="dxa" w:w="60"/>
-              <w:left w:type="dxa" w:w="100"/>
-              <w:bottom w:type="dxa" w:w="60"/>
-              <w:right w:type="dxa" w:w="100"/>
-            </w:tcMar>
-          </w:tcPr>
-          <w:p>
-            <w:r>
-              <w:rPr>
-                <w:rFonts w:ascii="Calibri" w:cs="Calibri" w:eastAsia="Calibri" w:hAnsi="Calibri"/>
-                <w:b w:val="false"/>
-                <w:bCs w:val="false"/>
-                <w:color w:val="1E293B"/>
-                <w:sz w:val="18"/>
-                <w:szCs w:val="18"/>
-              </w:rPr>
-              <w:t xml:space="preserve">Logging, chaining</w:t>
-            </w:r>
-          </w:p>
-        </w:tc>
-      </w:tr>
-      <w:tr>
-        <w:tc>
-          <w:tcPr>
-            <w:tcW w:type="dxa" w:w="2200"/>
-            <w:tcBorders>
-              <w:top w:val="single" w:color="E2E8F0" w:sz="1"/>
-              <w:left w:val="single" w:color="E2E8F0" w:sz="1"/>
-              <w:bottom w:val="single" w:color="E2E8F0" w:sz="1"/>
-              <w:right w:val="single" w:color="E2E8F0" w:sz="1"/>
-            </w:tcBorders>
-            <w:tcMar>
-              <w:top w:type="dxa" w:w="60"/>
-              <w:left w:type="dxa" w:w="100"/>
-              <w:bottom w:type="dxa" w:w="60"/>
-              <w:right w:type="dxa" w:w="100"/>
-            </w:tcMar>
-          </w:tcPr>
-          <w:p>
-            <w:r>
-              <w:rPr>
-                <w:rFonts w:ascii="Calibri" w:cs="Calibri" w:eastAsia="Calibri" w:hAnsi="Calibri"/>
-                <w:b/>
-                <w:bCs/>
-                <w:color w:val="1E293B"/>
-                <w:sz w:val="18"/>
-                <w:szCs w:val="18"/>
-              </w:rPr>
-              <w:t xml:space="preserve">PreCompact</w:t>
-            </w:r>
-          </w:p>
-        </w:tc>
-        <w:tc>
-          <w:tcPr>
-            <w:tcW w:type="dxa" w:w="2800"/>
-            <w:tcBorders>
-              <w:top w:val="single" w:color="E2E8F0" w:sz="1"/>
-              <w:left w:val="single" w:color="E2E8F0" w:sz="1"/>
-              <w:bottom w:val="single" w:color="E2E8F0" w:sz="1"/>
-              <w:right w:val="single" w:color="E2E8F0" w:sz="1"/>
-            </w:tcBorders>
-            <w:tcMar>
-              <w:top w:type="dxa" w:w="60"/>
-              <w:left w:type="dxa" w:w="100"/>
-              <w:bottom w:type="dxa" w:w="60"/>
-              <w:right w:type="dxa" w:w="100"/>
-            </w:tcMar>
-          </w:tcPr>
-          <w:p>
-            <w:r>
-              <w:rPr>
-                <w:rFonts w:ascii="Calibri" w:cs="Calibri" w:eastAsia="Calibri" w:hAnsi="Calibri"/>
-                <w:b w:val="false"/>
-                <w:bCs w:val="false"/>
-                <w:color w:val="1E293B"/>
-                <w:sz w:val="18"/>
-                <w:szCs w:val="18"/>
-              </w:rPr>
-              <w:t xml:space="preserve">Before compaction</w:t>
-            </w:r>
-          </w:p>
-        </w:tc>
-        <w:tc>
-          <w:tcPr>
-            <w:tcW w:type="dxa" w:w="5466"/>
-            <w:tcBorders>
-              <w:top w:val="single" w:color="E2E8F0" w:sz="1"/>
-              <w:left w:val="single" w:color="E2E8F0" w:sz="1"/>
-              <w:bottom w:val="single" w:color="E2E8F0" w:sz="1"/>
-              <w:right w:val="single" w:color="E2E8F0" w:sz="1"/>
-            </w:tcBorders>
-            <w:tcMar>
-              <w:top w:type="dxa" w:w="60"/>
-              <w:left w:type="dxa" w:w="100"/>
-              <w:bottom w:type="dxa" w:w="60"/>
-              <w:right w:type="dxa" w:w="100"/>
-            </w:tcMar>
-          </w:tcPr>
-          <w:p>
-            <w:r>
-              <w:rPr>
-                <w:rFonts w:ascii="Calibri" w:cs="Calibri" w:eastAsia="Calibri" w:hAnsi="Calibri"/>
-                <w:b w:val="false"/>
-                <w:bCs w:val="false"/>
-                <w:color w:val="1E293B"/>
-                <w:sz w:val="18"/>
-                <w:szCs w:val="18"/>
-              </w:rPr>
-              <w:t xml:space="preserve">Save context snapshots</w:t>
-            </w:r>
-          </w:p>
-        </w:tc>
-      </w:tr>
-      <w:tr>
-        <w:tc>
-          <w:tcPr>
-            <w:tcW w:type="dxa" w:w="2200"/>
-            <w:tcBorders>
-              <w:top w:val="single" w:color="E2E8F0" w:sz="1"/>
-              <w:left w:val="single" w:color="E2E8F0" w:sz="1"/>
-              <w:bottom w:val="single" w:color="E2E8F0" w:sz="1"/>
-              <w:right w:val="single" w:color="E2E8F0" w:sz="1"/>
-            </w:tcBorders>
-            <w:shd w:fill="F8FAFC" w:val="clear"/>
-            <w:tcMar>
-              <w:top w:type="dxa" w:w="60"/>
-              <w:left w:type="dxa" w:w="100"/>
-              <w:bottom w:type="dxa" w:w="60"/>
-              <w:right w:type="dxa" w:w="100"/>
-            </w:tcMar>
-          </w:tcPr>
-          <w:p>
-            <w:r>
-              <w:rPr>
-                <w:rFonts w:ascii="Calibri" w:cs="Calibri" w:eastAsia="Calibri" w:hAnsi="Calibri"/>
-                <w:b/>
-                <w:bCs/>
-                <w:color w:val="1E293B"/>
-                <w:sz w:val="18"/>
-                <w:szCs w:val="18"/>
-              </w:rPr>
-              <w:t xml:space="preserve">TaskCompleted</w:t>
-            </w:r>
-          </w:p>
-        </w:tc>
-        <w:tc>
-          <w:tcPr>
-            <w:tcW w:type="dxa" w:w="2800"/>
-            <w:tcBorders>
-              <w:top w:val="single" w:color="E2E8F0" w:sz="1"/>
-              <w:left w:val="single" w:color="E2E8F0" w:sz="1"/>
-              <w:bottom w:val="single" w:color="E2E8F0" w:sz="1"/>
-              <w:right w:val="single" w:color="E2E8F0" w:sz="1"/>
-            </w:tcBorders>
-            <w:shd w:fill="F8FAFC" w:val="clear"/>
-            <w:tcMar>
-              <w:top w:type="dxa" w:w="60"/>
-              <w:left w:type="dxa" w:w="100"/>
-              <w:bottom w:type="dxa" w:w="60"/>
-              <w:right w:type="dxa" w:w="100"/>
-            </w:tcMar>
-          </w:tcPr>
-          <w:p>
-            <w:r>
-              <w:rPr>
-                <w:rFonts w:ascii="Calibri" w:cs="Calibri" w:eastAsia="Calibri" w:hAnsi="Calibri"/>
-                <w:b w:val="false"/>
-                <w:bCs w:val="false"/>
-                <w:color w:val="1E293B"/>
-                <w:sz w:val="18"/>
-                <w:szCs w:val="18"/>
-              </w:rPr>
-              <w:t xml:space="preserve">Background task done</w:t>
-            </w:r>
-          </w:p>
-        </w:tc>
-        <w:tc>
-          <w:tcPr>
-            <w:tcW w:type="dxa" w:w="5466"/>
-            <w:tcBorders>
-              <w:top w:val="single" w:color="E2E8F0" w:sz="1"/>
-              <w:left w:val="single" w:color="E2E8F0" w:sz="1"/>
-              <w:bottom w:val="single" w:color="E2E8F0" w:sz="1"/>
-              <w:right w:val="single" w:color="E2E8F0" w:sz="1"/>
-            </w:tcBorders>
-            <w:shd w:fill="F8FAFC" w:val="clear"/>
-            <w:tcMar>
-              <w:top w:type="dxa" w:w="60"/>
-              <w:left w:type="dxa" w:w="100"/>
-              <w:bottom w:type="dxa" w:w="60"/>
-              <w:right w:type="dxa" w:w="100"/>
-            </w:tcMar>
-          </w:tcPr>
-          <w:p>
-            <w:r>
-              <w:rPr>
-                <w:rFonts w:ascii="Calibri" w:cs="Calibri" w:eastAsia="Calibri" w:hAnsi="Calibri"/>
-                <w:b w:val="false"/>
-                <w:bCs w:val="false"/>
-                <w:color w:val="1E293B"/>
-                <w:sz w:val="18"/>
-                <w:szCs w:val="18"/>
-              </w:rPr>
-              <w:t xml:space="preserve">Notifications</w:t>
             </w:r>
           </w:p>
         </w:tc>
@@ -2637,7 +2215,7 @@
           <w:sz w:val="17"/>
           <w:szCs w:val="17"/>
         </w:rPr>
-        <w:t xml:space="preserve">    "matcher": "Write|Edit",</w:t>
+        <w:t xml:space="preserve">    "matcher": "bash",</w:t>
       </w:r>
     </w:p>
     <w:p>
@@ -2682,7 +2260,7 @@
           <w:sz w:val="17"/>
           <w:szCs w:val="17"/>
         </w:rPr>
-        <w:t xml:space="preserve">      "command": "npx prettier --write $CLAUDE_FILE_PATH"</w:t>
+        <w:t xml:space="preserve">      "command": "bash -c 'if grep -qE \"(rm -rf|:/|:a|mkfs|dd if)\" &lt;&lt;&lt; "$TOOL_INPUT"; then echo 'Dangerous command blocked'; exit 1; fi'"</w:t>
       </w:r>
     </w:p>
     <w:p>
@@ -3403,70 +2981,6 @@
               <w:bottom w:val="single" w:color="E2E8F0" w:sz="1"/>
               <w:right w:val="single" w:color="E2E8F0" w:sz="1"/>
             </w:tcBorders>
-            <w:shd w:fill="F8FAFC" w:val="clear"/>
-            <w:tcMar>
-              <w:top w:type="dxa" w:w="60"/>
-              <w:left w:type="dxa" w:w="100"/>
-              <w:bottom w:type="dxa" w:w="60"/>
-              <w:right w:type="dxa" w:w="100"/>
-            </w:tcMar>
-          </w:tcPr>
-          <w:p>
-            <w:r>
-              <w:rPr>
-                <w:rFonts w:ascii="Calibri" w:cs="Calibri" w:eastAsia="Calibri" w:hAnsi="Calibri"/>
-                <w:b/>
-                <w:bCs/>
-                <w:color w:val="1E293B"/>
-                <w:sz w:val="18"/>
-                <w:szCs w:val="18"/>
-              </w:rPr>
-              <w:t xml:space="preserve">--worktree</w:t>
-            </w:r>
-          </w:p>
-        </w:tc>
-        <w:tc>
-          <w:tcPr>
-            <w:tcW w:type="dxa" w:w="6466"/>
-            <w:tcBorders>
-              <w:top w:val="single" w:color="E2E8F0" w:sz="1"/>
-              <w:left w:val="single" w:color="E2E8F0" w:sz="1"/>
-              <w:bottom w:val="single" w:color="E2E8F0" w:sz="1"/>
-              <w:right w:val="single" w:color="E2E8F0" w:sz="1"/>
-            </w:tcBorders>
-            <w:shd w:fill="F8FAFC" w:val="clear"/>
-            <w:tcMar>
-              <w:top w:type="dxa" w:w="60"/>
-              <w:left w:type="dxa" w:w="100"/>
-              <w:bottom w:type="dxa" w:w="60"/>
-              <w:right w:type="dxa" w:w="100"/>
-            </w:tcMar>
-          </w:tcPr>
-          <w:p>
-            <w:r>
-              <w:rPr>
-                <w:rFonts w:ascii="Calibri" w:cs="Calibri" w:eastAsia="Calibri" w:hAnsi="Calibri"/>
-                <w:b w:val="false"/>
-                <w:bCs w:val="false"/>
-                <w:color w:val="1E293B"/>
-                <w:sz w:val="18"/>
-                <w:szCs w:val="18"/>
-              </w:rPr>
-              <w:t xml:space="preserve">Isolated parallel session (git worktree)</w:t>
-            </w:r>
-          </w:p>
-        </w:tc>
-      </w:tr>
-      <w:tr>
-        <w:tc>
-          <w:tcPr>
-            <w:tcW w:type="dxa" w:w="4000"/>
-            <w:tcBorders>
-              <w:top w:val="single" w:color="E2E8F0" w:sz="1"/>
-              <w:left w:val="single" w:color="E2E8F0" w:sz="1"/>
-              <w:bottom w:val="single" w:color="E2E8F0" w:sz="1"/>
-              <w:right w:val="single" w:color="E2E8F0" w:sz="1"/>
-            </w:tcBorders>
             <w:tcMar>
               <w:top w:type="dxa" w:w="60"/>
               <w:left w:type="dxa" w:w="100"/>
@@ -3908,8 +3422,8 @@
       </w:r>
     </w:p>
     <w:sectPr>
-      <w:headerReference w:type="default" r:id="rId7"/>
-      <w:footerReference w:type="default" r:id="rId8"/>
+      <w:headerReference w:type="default" ns2:id="rId7"/>
+      <w:footerReference w:type="default" ns2:id="rId8"/>
       <w:pgSz w:w="11906" w:h="16838" w:orient="portrait"/>
       <w:pgMar w:top="720" w:right="720" w:bottom="720" w:left="720" w:header="708" w:footer="708" w:gutter="0"/>
       <w:pgNumType/>

</xml_diff>